<commit_message>
Generalized the consent form so we can also use it for the work group
</commit_message>
<xml_diff>
--- a/World Cafe Facilitation Guide/Source/Informed Consent Form.docx
+++ b/World Cafe Facilitation Guide/Source/Informed Consent Form.docx
@@ -1139,16 +1139,16 @@
               <w:t xml:space="preserve">Yes, </w:t>
             </w:r>
             <w:r>
-              <w:t xml:space="preserve">I agree to participate in the </w:t>
-            </w:r>
-            <w:r>
-              <w:rPr>
-                <w:lang w:val="en-US"/>
-              </w:rPr>
-              <w:t>World Cafe</w:t>
-            </w:r>
-            <w:r>
-              <w:t xml:space="preserve"> as part of the </w:t>
+              <w:t xml:space="preserve">I agree to participate </w:t>
+            </w:r>
+            <w:r>
+              <w:rPr>
+                <w:lang w:val="en-US"/>
+              </w:rPr>
+              <w:t xml:space="preserve">in </w:t>
+            </w:r>
+            <w:r>
+              <w:t xml:space="preserve">the </w:t>
             </w:r>
             <w:r>
               <w:rPr>

</xml_diff>